<commit_message>
DPS 9.º: capacidades cotejadas con el Programa MEC 2014 (4, 6, 7 y 11 corregidas); fuentes 8.º y 9.º
- fuentes_mec/: programas completos MEC 2014 de 8.º y 9.º con SHA-256 y FUENTES_CURRICULARES.md
- CAP9 corregida a la redacción literal (págs. 53-55) y propagada a tomo, fichas PEC, Plan Anual
  y Planes; rótulo «(programa MEC)» restituido en 9.º
- verificar.py: cada capacidad se comprueba contra el PDF del programa (7.º, 8.º y 9.º en 0 fallos)
- 7.º y 8.º: entregables sin cambios (faa8ef9)
- informe 9.º: sección 9 con el cotejo

Co-Authored-By: Claude Opus 5.5 <noreply@anthropic.com>
Claude-Session: https://claude.ai/code/session_01LqBrALZn8HbnzzUtvCFRMa
</commit_message>
<xml_diff>
--- a/dps_3er_ciclo/combos_2026/9no/DPS_9no_PLAN_ANUAL_PEC_OFICIO_2026.docx
+++ b/dps_3er_ciclo/combos_2026/9no/DPS_9no_PLAN_ANUAL_PEC_OFICIO_2026.docx
@@ -307,7 +307,7 @@
                 <w:color w:val="FFFFFF"/>
                 <w:sz w:val="18"/>
               </w:rPr>
-              <w:t xml:space="preserve">Capacidades: «Establece relaciones armónicas en su comunicación interpersonal con los miembros de la comunidad educativa.» «Interpreta los criterios de evaluación a ser considerados en el noveno grado en sus distintas funciones.»</w:t>
+              <w:t xml:space="preserve">Capacidades (programa MEC): «Establece relaciones armónicas en su comunicación interpersonal con los miembros de la comunidad educativa.» «Interpreta los criterios de evaluación a ser considerados en el noveno grado en sus distintas funciones.»</w:t>
             </w:r>
           </w:p>
           <w:p>
@@ -878,7 +878,7 @@
                 <w:color w:val="FFFFFF"/>
                 <w:sz w:val="18"/>
               </w:rPr>
-              <w:t xml:space="preserve">Capacidades: «Reconoce la importancia de conocerse a sí mismo, sus intereses, sus habilidades, sus potencialidades y sus preferencias.» «Interpreta lo positivo de una Orientación Vocacional para la acertada elección del Bachillerato.»</w:t>
+              <w:t xml:space="preserve">Capacidades (programa MEC): «Reconoce la importancia de conocerse a sí mismo, sus intereses, sus habilidades, sus potencialidades y sus preferencias.» «Interpreta lo positivo de una Orientación Vocacional para la acertada elección del Bachillerato (ofertas educativas posteriores al tercer ciclo).»</w:t>
             </w:r>
           </w:p>
           <w:p>
@@ -1584,7 +1584,7 @@
                 <w:color w:val="FFFFFF"/>
                 <w:sz w:val="18"/>
               </w:rPr>
-              <w:t xml:space="preserve">Capacidades: «Expresa sus emociones de manera equilibrada, demostrando autocontrol en sus actividades.» «Conoce la implicancia de la sexualidad como un todo y su enfoque desde la perspectiva de derecho.»</w:t>
+              <w:t xml:space="preserve">Capacidades (programa MEC): «Expresa sus emociones de manera equilibrada, demostrando autocontrol en sus actividades.» «Conoce la implicancia de la sexualidad como componente de la personalidad.»</w:t>
             </w:r>
           </w:p>
           <w:p>
@@ -2290,7 +2290,7 @@
                 <w:color w:val="FFFFFF"/>
                 <w:sz w:val="18"/>
               </w:rPr>
-              <w:t xml:space="preserve">Capacidades: «Emprende acciones que promuevan el cumplimiento de los artículos de los DD. HH. referentes a la no discriminación.»</w:t>
+              <w:t xml:space="preserve">Capacidades (programa MEC): «Emprende acciones que promuevan el cumplimiento de los artículos de los DD. HH referentes a la no discriminación.»</w:t>
             </w:r>
           </w:p>
           <w:p>
@@ -2872,7 +2872,7 @@
                 <w:color w:val="FFFFFF"/>
                 <w:sz w:val="18"/>
               </w:rPr>
-              <w:t xml:space="preserve">Capacidades: «Analiza los procesos democráticos de elección de autoridades de la comunidad educativa en el estamento estudiantil.» «Participa activamente y con conocimientos adecuados en el proceso de conformación del Centro de Estudiantes.»</w:t>
+              <w:t xml:space="preserve">Capacidades (programa MEC): «Analiza los procesos democráticos de elección de autoridades de la comunidad educativa en el estamento estudiantil.» «Participa activamente y con conocimientos adecuados en el proceso de conformación del Centro de Estudiantes.»</w:t>
             </w:r>
           </w:p>
           <w:p>
@@ -3059,7 +3059,7 @@
                 <w:rFonts w:ascii="Calibri" w:hAnsi="Calibri"/>
                 <w:sz w:val="17"/>
               </w:rPr>
-              <w:t xml:space="preserve">Taller PEC A — Mirar antes de actuar. Diagnóstico participativo de necesidades. Capacidades del área vinculadas: «Establece relaciones armónicas en su comunicación interpersonal con los miembros de la comunidad educativa.» «Diagnostica situaciones de riesgo en su ámbito familiar, escolar y comunitario.» Indicadores: elaboración editorial.</w:t>
+              <w:t xml:space="preserve">Taller PEC A — Mirar antes de actuar. Diagnóstico participativo de necesidades. Capacidades del área vinculadas (programa MEC): «Establece relaciones armónicas en su comunicación interpersonal con los miembros de la comunidad educativa.» «Diagnostica situaciones de riesgo en su ámbito familiar, escolar y en su comunidad.» Indicadores: elaboración editorial.</w:t>
             </w:r>
           </w:p>
         </w:tc>
@@ -3346,7 +3346,7 @@
                 <w:rFonts w:ascii="Calibri" w:hAnsi="Calibri"/>
                 <w:sz w:val="17"/>
               </w:rPr>
-              <w:t xml:space="preserve">Taller PEC B — Elegir con razones. Priorización y fundamentación del problema. Capacidades del área vinculadas: «Analiza los procesos democráticos de elección de autoridades de la comunidad educativa en el estamento estudiantil.» «Establece relaciones armónicas en su comunicación interpersonal con los miembros de la comunidad educativa.» Indicadores: elaboración editorial.</w:t>
+              <w:t xml:space="preserve">Taller PEC B — Elegir con razones. Priorización y fundamentación del problema. Capacidades del área vinculadas (programa MEC): «Analiza los procesos democráticos de elección de autoridades de la comunidad educativa en el estamento estudiantil.» «Establece relaciones armónicas en su comunicación interpersonal con los miembros de la comunidad educativa.» Indicadores: elaboración editorial.</w:t>
             </w:r>
           </w:p>
         </w:tc>
@@ -3747,7 +3747,7 @@
                 <w:color w:val="FFFFFF"/>
                 <w:sz w:val="18"/>
               </w:rPr>
-              <w:t xml:space="preserve">Capacidades: «Elabora su cronograma de actividades considerando como eje principal su proceso de aprendizaje.»</w:t>
+              <w:t xml:space="preserve">Capacidades (programa MEC): «Elabora su cronograma de actividades considerando como eje principal su proceso de aprendizaje.»</w:t>
             </w:r>
           </w:p>
           <w:p>
@@ -3934,7 +3934,7 @@
                 <w:rFonts w:ascii="Calibri" w:hAnsi="Calibri"/>
                 <w:sz w:val="17"/>
               </w:rPr>
-              <w:t xml:space="preserve">Taller PEC C — Pasar de la idea al plan. Objetivos, beneficiarios y productos. Capacidades del área vinculadas: «Emprende acciones que promuevan el cumplimiento de los artículos de los DD. HH. referentes a la no discriminación.» «Considera la gestión de riesgo en la vida cotidiana.» Indicadores: elaboración editorial.</w:t>
+              <w:t xml:space="preserve">Taller PEC C — Pasar de la idea al plan. Objetivos, beneficiarios y productos. Capacidades del área vinculadas (programa MEC): «Emprende acciones que promuevan el cumplimiento de los artículos de los DD. HH referentes a la no discriminación.» «Considera la gestión de riesgo en la vida cotidiana.» Indicadores: elaboración editorial.</w:t>
             </w:r>
           </w:p>
         </w:tc>
@@ -4222,7 +4222,7 @@
                 <w:rFonts w:ascii="Calibri" w:hAnsi="Calibri"/>
                 <w:sz w:val="17"/>
               </w:rPr>
-              <w:t xml:space="preserve">Taller PEC D — Organizar para cumplir. Cronograma, roles, recursos y autorizaciones. Capacidades del área vinculadas: «Elabora su cronograma de actividades considerando como eje principal su proceso de aprendizaje.» «Participa activamente y con conocimientos adecuados en el proceso de conformación del Centro de Estudiantes.» Indicadores: elaboración editorial.</w:t>
+              <w:t xml:space="preserve">Taller PEC D — Organizar para cumplir. Cronograma, roles, recursos y autorizaciones. Capacidades del área vinculadas (programa MEC): «Elabora su cronograma de actividades considerando como eje principal su proceso de aprendizaje.» «Participa activamente y con conocimientos adecuados en el proceso de conformación del Centro de Estudiantes.» Indicadores: elaboración editorial.</w:t>
             </w:r>
           </w:p>
         </w:tc>
@@ -4487,7 +4487,7 @@
                 <w:color w:val="FFFFFF"/>
                 <w:sz w:val="18"/>
               </w:rPr>
-              <w:t xml:space="preserve">Capacidades: «Diagnostica situaciones de riesgo en su ámbito familiar, escolar y comunitario.» «Considera la gestión de riesgo en la vida cotidiana.» «Aplica normas de comportamiento en caso de riesgos.»</w:t>
+              <w:t xml:space="preserve">Capacidades (programa MEC): «Diagnostica situaciones de riesgo en su ámbito familiar, escolar y en su comunidad.» «Considera la gestión de riesgo en la vida cotidiana.» «Aplica normas de comportamiento en caso de riesgos.»</w:t>
             </w:r>
           </w:p>
           <w:p>
@@ -4674,7 +4674,7 @@
                 <w:rFonts w:ascii="Calibri" w:hAnsi="Calibri"/>
                 <w:sz w:val="17"/>
               </w:rPr>
-              <w:t xml:space="preserve">Taller PEC E — Actuar y registrar. Ejecución segura y bitácora. Capacidades del área vinculadas: «Aplica normas de comportamiento en caso de riesgos.» «Elabora su cronograma de actividades considerando como eje principal su proceso de aprendizaje.» Indicadores: elaboración editorial.</w:t>
+              <w:t xml:space="preserve">Taller PEC E — Actuar y registrar. Ejecución segura y bitácora. Capacidades del área vinculadas (programa MEC): «Aplica normas de comportamiento en caso de riesgos.» «Elabora su cronograma de actividades considerando como eje principal su proceso de aprendizaje.» Indicadores: elaboración editorial.</w:t>
             </w:r>
           </w:p>
         </w:tc>
@@ -5097,7 +5097,7 @@
                 <w:rFonts w:ascii="Calibri" w:hAnsi="Calibri"/>
                 <w:sz w:val="17"/>
               </w:rPr>
-              <w:t xml:space="preserve">Taller PEC F — Aprender de los resultados. Evaluación, informe y devolución. Capacidades del área vinculadas: «Interpreta los criterios de evaluación a ser considerados en el noveno grado en sus distintas funciones.» «Emprende acciones que promuevan el cumplimiento de los artículos de los DD. HH. referentes a la no discriminación.» Indicadores: elaboración editorial.</w:t>
+              <w:t xml:space="preserve">Taller PEC F — Aprender de los resultados. Evaluación, informe y devolución. Capacidades del área vinculadas (programa MEC): «Interpreta los criterios de evaluación a ser considerados en el noveno grado en sus distintas funciones.» «Emprende acciones que promuevan el cumplimiento de los artículos de los DD. HH referentes a la no discriminación.» Indicadores: elaboración editorial.</w:t>
             </w:r>
           </w:p>
         </w:tc>

</xml_diff>